<commit_message>
article: ППВ submission prep — front matter, figures-in-DOCX, checklist + cover letter
- ppv_draft.md: added УДК (candidate) + bilingual author block (ORCID placeholder).
- build_docx.py: rasterises the 8 embedded SVGs to PNG and rebuilds ppv_draft.docx with working figures (pandoc can't embed SVG). DOCX/HTML rebuilt.
- export_figures_submission.py: separate 300 dpi JPEGs + captions.txt (ППВ illustration rule) in article/figures_submission/.
- ppv_submission_checklist.md: audit vs official ППВ rules. Blockers found: length 93.8k chars vs 40k limit (2.34x); citation style must become in-text (Author Year: page) + Latin References (both missing); abstracts over 1200-char limit.
- ppv_cover_letter.md: draft Russian cover letter + reviewer-profile guidance.

Co-Authored-By: Claude Opus 4.7 <noreply@anthropic.com>
</commit_message>
<xml_diff>
--- a/article/ppv_draft.docx
+++ b/article/ppv_draft.docx
@@ -2,15 +2,41 @@
 <file path=word/document.xml><?xml version="1.0" encoding="utf-8"?>
 <w:document xmlns:w="http://schemas.openxmlformats.org/wordprocessingml/2006/main" xmlns:m="http://schemas.openxmlformats.org/officeDocument/2006/math" xmlns:r="http://schemas.openxmlformats.org/officeDocument/2006/relationships" xmlns:o="urn:schemas-microsoft-com:office:office" xmlns:v="urn:schemas-microsoft-com:vml" xmlns:w10="urn:schemas-microsoft-com:office:word" xmlns:a="http://schemas.openxmlformats.org/drawingml/2006/main" xmlns:pic="http://schemas.openxmlformats.org/drawingml/2006/picture" xmlns:wp="http://schemas.openxmlformats.org/drawingml/2006/wordprocessingDrawing">
   <w:body>
-    <w:p>
-      <w:pPr>
-        <w:pStyle w:val="Title"/>
-      </w:pPr>
-      <w:r>
-        <w:t xml:space="preserve">Зографские и Рериховские чтения, 2004–2026</w:t>
-      </w:r>
-    </w:p>
-    <w:bookmarkStart w:id="81" w:name="X5255a80af6f15ace933f04c3f50effef4c1a446"/>
+    <w:sdt>
+      <w:sdtPr>
+        <w:docPartObj>
+          <w:docPartGallery w:val="Table of Contents"/>
+          <w:docPartUnique/>
+        </w:docPartObj>
+      </w:sdtPr>
+      <w:sdtContent>
+        <w:p>
+          <w:pPr>
+            <w:pStyle w:val="TOCHeading"/>
+          </w:pPr>
+          <w:r>
+            <w:t xml:space="preserve">Table of Contents</w:t>
+          </w:r>
+        </w:p>
+        <w:p>
+          <w:r>
+            <w:fldChar w:fldCharType="begin" w:dirty="true"/>
+            <w:instrText xml:space="preserve">TOC \o "1-2" \h \z \u</w:instrText>
+            <w:fldChar w:fldCharType="separate"/>
+            <w:fldChar w:fldCharType="end"/>
+          </w:r>
+        </w:p>
+      </w:sdtContent>
+    </w:sdt>
+    <w:p>
+      <w:pPr>
+        <w:pStyle w:val="FirstParagraph"/>
+      </w:pPr>
+      <w:r>
+        <w:t xml:space="preserve">УДК 061.3:001.32(470:540)</w:t>
+      </w:r>
+    </w:p>
+    <w:bookmarkStart w:id="82" w:name="X5255a80af6f15ace933f04c3f50effef4c1a446"/>
     <w:p>
       <w:pPr>
         <w:pStyle w:val="Heading1"/>
@@ -21,6 +47,61 @@
     </w:p>
     <w:p>
       <w:pPr>
+        <w:pStyle w:val="FirstParagraph"/>
+      </w:pPr>
+      <w:r>
+        <w:rPr>
+          <w:b/>
+          <w:bCs/>
+        </w:rPr>
+        <w:t xml:space="preserve">М. Ю. Гасунс</w:t>
+      </w:r>
+      <w:r>
+        <w:t xml:space="preserve"> </w:t>
+      </w:r>
+      <w:r>
+        <w:t xml:space="preserve">— независимый исследователь, Москва, Россия.</w:t>
+      </w:r>
+      <w:r>
+        <w:t xml:space="preserve"> </w:t>
+      </w:r>
+      <w:r>
+        <w:t xml:space="preserve">E-mail: gasyoun@gmail.com. ORCID: ___________________</w:t>
+      </w:r>
+      <w:r>
+        <w:t xml:space="preserve"> </w:t>
+      </w:r>
+      <w:r>
+        <w:rPr>
+          <w:i/>
+          <w:iCs/>
+        </w:rPr>
+        <w:t xml:space="preserve">(заполнить перед подачей)</w:t>
+      </w:r>
+      <w:r>
+        <w:t xml:space="preserve">.</w:t>
+      </w:r>
+    </w:p>
+    <w:p>
+      <w:pPr>
+        <w:pStyle w:val="BodyText"/>
+      </w:pPr>
+      <w:r>
+        <w:rPr>
+          <w:b/>
+          <w:bCs/>
+        </w:rPr>
+        <w:t xml:space="preserve">M. Yu. Gasūns</w:t>
+      </w:r>
+      <w:r>
+        <w:t xml:space="preserve"> </w:t>
+      </w:r>
+      <w:r>
+        <w:t xml:space="preserve">— independent researcher, Moscow, Russia.</w:t>
+      </w:r>
+    </w:p>
+    <w:p>
+      <w:pPr>
         <w:pStyle w:val="BlockText"/>
       </w:pPr>
       <w:r>
@@ -60,7 +141,13 @@
         <w:t xml:space="preserve"> </w:t>
       </w:r>
       <w:r>
-        <w:t xml:space="preserve">синхронизированы базовые числа статьи с сайтом и текущей БД.</w:t>
+        <w:t xml:space="preserve">синхронизированы базовые числа статьи с сайтом и текущей БД, а также формализованы</w:t>
+      </w:r>
+      <w:r>
+        <w:t xml:space="preserve"> </w:t>
+      </w:r>
+      <w:r>
+        <w:t xml:space="preserve">дополнительные гипотезы Н11–Н15.</w:t>
       </w:r>
     </w:p>
     <w:p>
@@ -3369,7 +3456,7 @@
       <w:r>
         <w:drawing>
           <wp:inline>
-            <wp:extent cx="5334000" cy="3619500"/>
+            <wp:extent cx="5334000" cy="3617976"/>
             <wp:effectExtent b="0" l="0" r="0" t="0"/>
             <wp:docPr descr="Рис. 1. Обновление состава: новички, ретроспективное ядро и повторные участники" title="" id="18" name="Picture"/>
             <a:graphic>
@@ -3390,7 +3477,7 @@
                   <pic:spPr bwMode="auto">
                     <a:xfrm>
                       <a:off x="0" y="0"/>
-                      <a:ext cx="5334000" cy="3619500"/>
+                      <a:ext cx="5334000" cy="3617976"/>
                     </a:xfrm>
                     <a:prstGeom prst="rect">
                       <a:avLst/>
@@ -7236,7 +7323,7 @@
       <w:r>
         <w:drawing>
           <wp:inline>
-            <wp:extent cx="5334000" cy="3226209"/>
+            <wp:extent cx="5334000" cy="3225024"/>
             <wp:effectExtent b="0" l="0" r="0" t="0"/>
             <wp:docPr descr="Рис. 2. Покрытие годом рождения является полным по всем частотным группам" title="" id="38" name="Picture"/>
             <a:graphic>
@@ -7257,7 +7344,7 @@
                   <pic:spPr bwMode="auto">
                     <a:xfrm>
                       <a:off x="0" y="0"/>
-                      <a:ext cx="5334000" cy="3226209"/>
+                      <a:ext cx="5334000" cy="3225024"/>
                     </a:xfrm>
                     <a:prstGeom prst="rect">
                       <a:avLst/>
@@ -7299,7 +7386,7 @@
       <w:r>
         <w:drawing>
           <wp:inline>
-            <wp:extent cx="5334000" cy="3266603"/>
+            <wp:extent cx="5334000" cy="3264505"/>
             <wp:effectExtent b="0" l="0" r="0" t="0"/>
             <wp:docPr descr="Рис. 3. Возраст первого наблюдаемого выступления в корпусе" title="" id="41" name="Picture"/>
             <a:graphic>
@@ -7320,7 +7407,7 @@
                   <pic:spPr bwMode="auto">
                     <a:xfrm>
                       <a:off x="0" y="0"/>
-                      <a:ext cx="5334000" cy="3266603"/>
+                      <a:ext cx="5334000" cy="3264505"/>
                     </a:xfrm>
                     <a:prstGeom prst="rect">
                       <a:avLst/>
@@ -7352,39 +7439,13 @@
         <w:pStyle w:val="BodyText"/>
       </w:pPr>
       <w:r>
-        <w:t xml:space="preserve">Анализ возраста первого наблюдаемого выступления в корпусе (Рис. 3) теперь охватывает всех 220 ученых. Медиана возраста дебюта статистически значимо снижается по трем периодам: с 47.0 лет в 2004–2010 гг. до 36.0 лет в 2011–2017 гг. и сохраняется на уровне 36.0 лет в 2018–2026 гг. Этот нисходящий тренд является статистически достоверным: корреляция Спирмена между годом дебюта и возрастом дебюта равна</w:t>
-      </w:r>
-      <w:r>
-        <w:t xml:space="preserve"> </w:t>
-      </w:r>
-      <m:oMath>
-        <m:r>
-          <m:t>h</m:t>
-        </m:r>
-        <m:r>
-          <m:t>o</m:t>
-        </m:r>
-        <m:r>
-          <m:rPr>
-            <m:sty m:val="p"/>
-          </m:rPr>
-          <m:t>=</m:t>
-        </m:r>
-        <m:r>
-          <m:rPr>
-            <m:sty m:val="p"/>
-          </m:rPr>
-          <m:t>−</m:t>
-        </m:r>
-        <m:r>
-          <m:t>0.19</m:t>
-        </m:r>
-      </m:oMath>
-      <w:r>
-        <w:t xml:space="preserve"> </w:t>
-      </w:r>
-      <w:r>
-        <w:t xml:space="preserve">(</w:t>
+        <w:t xml:space="preserve">Анализ возраста первого наблюдаемого выступления в корпусе (Рис. 3) теперь охватывает всех 220 ученых. Медиана возраста дебюта статистически значимо снижается по трем периодам: с 47.0 лет в 2004–2010 гг. до 36.0 лет в 2011–2017 гг. и сохраняется на уровне 36.0 лет в 2018–2026 гг. Этот нисходящий тренд является статистически достоверным: корреляция Спирмена между годом дебюта и возрастом дебюта равна $</w:t>
+      </w:r>
+      <w:r>
+        <w:t xml:space="preserve"> </w:t>
+      </w:r>
+      <w:r>
+        <w:t xml:space="preserve">ho = -0.19$ (</w:t>
       </w:r>
       <m:oMath>
         <m:r>
@@ -7679,7 +7740,7 @@
       <w:r>
         <w:drawing>
           <wp:inline>
-            <wp:extent cx="5334000" cy="3298784"/>
+            <wp:extent cx="5334000" cy="3299381"/>
             <wp:effectExtent b="0" l="0" r="0" t="0"/>
             <wp:docPr descr="Рис. 4. Тематическая матрица L1 × L2" title="" id="45" name="Picture"/>
             <a:graphic>
@@ -7700,7 +7761,7 @@
                   <pic:spPr bwMode="auto">
                     <a:xfrm>
                       <a:off x="0" y="0"/>
-                      <a:ext cx="5334000" cy="3298784"/>
+                      <a:ext cx="5334000" cy="3299381"/>
                     </a:xfrm>
                     <a:prstGeom prst="rect">
                       <a:avLst/>
@@ -10212,7 +10273,7 @@
       <w:r>
         <w:drawing>
           <wp:inline>
-            <wp:extent cx="5334000" cy="3809585"/>
+            <wp:extent cx="5334000" cy="3808009"/>
             <wp:effectExtent b="0" l="0" r="0" t="0"/>
             <wp:docPr descr="Рис. 5. Перекрестная когорта: баланс участия на двух площадках" title="" id="53" name="Picture"/>
             <a:graphic>
@@ -10233,7 +10294,7 @@
                   <pic:spPr bwMode="auto">
                     <a:xfrm>
                       <a:off x="0" y="0"/>
-                      <a:ext cx="5334000" cy="3809585"/>
+                      <a:ext cx="5334000" cy="3808009"/>
                     </a:xfrm>
                     <a:prstGeom prst="rect">
                       <a:avLst/>
@@ -10317,7 +10378,7 @@
       <w:r>
         <w:drawing>
           <wp:inline>
-            <wp:extent cx="5334000" cy="3305657"/>
+            <wp:extent cx="5334000" cy="3305577"/>
             <wp:effectExtent b="0" l="0" r="0" t="0"/>
             <wp:docPr descr="Рис. 6. Сессионная центральность участников по совместным сессиям" title="" id="56" name="Picture"/>
             <a:graphic>
@@ -10338,7 +10399,7 @@
                   <pic:spPr bwMode="auto">
                     <a:xfrm>
                       <a:off x="0" y="0"/>
-                      <a:ext cx="5334000" cy="3305657"/>
+                      <a:ext cx="5334000" cy="3305577"/>
                     </a:xfrm>
                     <a:prstGeom prst="rect">
                       <a:avLst/>
@@ -10422,13 +10483,13 @@
       </w:r>
     </w:p>
     <w:bookmarkEnd w:id="58"/>
-    <w:bookmarkStart w:id="59" w:name="заключение"/>
+    <w:bookmarkStart w:id="59" w:name="X4f170e5e280334d08f9d70bdc0189b7a99d7fa7"/>
     <w:p>
       <w:pPr>
         <w:pStyle w:val="Heading2"/>
       </w:pPr>
       <w:r>
-        <w:t xml:space="preserve">10. Заключение</w:t>
+        <w:t xml:space="preserve">10. Дополнительные гипотезы: источники, видео и масштаб обобщения</w:t>
       </w:r>
     </w:p>
     <w:p>
@@ -10436,7 +10497,496 @@
         <w:pStyle w:val="FirstParagraph"/>
       </w:pPr>
       <w:r>
-        <w:t xml:space="preserve">Главные выводы настоящего исследования можно резюмировать в одиннадцати пунктах.</w:t>
+        <w:t xml:space="preserve">После основной проверки Н1–Н10 корпус позволяет поставить еще пять гипотез,</w:t>
+      </w:r>
+      <w:r>
+        <w:t xml:space="preserve"> </w:t>
+      </w:r>
+      <w:r>
+        <w:t xml:space="preserve">связанных не столько с численностью площадок, сколько с устройством источниковой</w:t>
+      </w:r>
+      <w:r>
+        <w:t xml:space="preserve"> </w:t>
+      </w:r>
+      <w:r>
+        <w:t xml:space="preserve">видимости. Их статус различен: часть уже проверяется текущими таблицами, часть</w:t>
+      </w:r>
+      <w:r>
+        <w:t xml:space="preserve"> </w:t>
+      </w:r>
+      <w:r>
+        <w:t xml:space="preserve">требует отдельного биографического слоя данных и поэтому ниже фиксируется как</w:t>
+      </w:r>
+      <w:r>
+        <w:t xml:space="preserve"> </w:t>
+      </w:r>
+      <w:r>
+        <w:t xml:space="preserve">проверяемая, но пока не доказанная исследовательская программа.</w:t>
+      </w:r>
+    </w:p>
+    <w:p>
+      <w:pPr>
+        <w:pStyle w:val="BodyText"/>
+      </w:pPr>
+      <w:r>
+        <w:rPr>
+          <w:b/>
+          <w:bCs/>
+        </w:rPr>
+        <w:t xml:space="preserve">Н11. «Город вместо учреждения» является эффектом формата программы, а не прямым</w:t>
+      </w:r>
+      <w:r>
+        <w:rPr>
+          <w:b/>
+          <w:bCs/>
+        </w:rPr>
+        <w:t xml:space="preserve"> </w:t>
+      </w:r>
+      <w:r>
+        <w:rPr>
+          <w:b/>
+          <w:bCs/>
+        </w:rPr>
+        <w:t xml:space="preserve">признаком внеинституционального статуса участника.</w:t>
+      </w:r>
+      <w:r>
+        <w:t xml:space="preserve"> </w:t>
+      </w:r>
+      <w:r>
+        <w:t xml:space="preserve">Эта гипотеза подтверждается</w:t>
+      </w:r>
+      <w:r>
+        <w:t xml:space="preserve"> </w:t>
+      </w:r>
+      <w:r>
+        <w:t xml:space="preserve">сильнее всего. В 899 авторских участиях доля записей, где вместо учреждения указан</w:t>
+      </w:r>
+      <w:r>
+        <w:t xml:space="preserve"> </w:t>
+      </w:r>
+      <w:r>
+        <w:t xml:space="preserve">только город, резко различается между площадками: 94.7% для Зографских чтений</w:t>
+      </w:r>
+      <w:r>
+        <w:t xml:space="preserve"> </w:t>
+      </w:r>
+      <w:r>
+        <w:t xml:space="preserve">против 13.0% для Рериховских. Стратифицированная по годам проверка (метод</w:t>
+      </w:r>
+      <w:r>
+        <w:t xml:space="preserve"> </w:t>
+      </w:r>
+      <w:r>
+        <w:t xml:space="preserve">Кохрана–Мантеля–Хензеля) дает отношение шансов около 157 при</w:t>
+      </w:r>
+      <w:r>
+        <w:t xml:space="preserve"> </w:t>
+      </w:r>
+      <m:oMath>
+        <m:r>
+          <m:t>p</m:t>
+        </m:r>
+        <m:r>
+          <m:rPr>
+            <m:sty m:val="p"/>
+          </m:rPr>
+          <m:t>≈</m:t>
+        </m:r>
+        <m:r>
+          <m:t>8</m:t>
+        </m:r>
+        <m:r>
+          <m:rPr>
+            <m:sty m:val="p"/>
+          </m:rPr>
+          <m:t>×</m:t>
+        </m:r>
+        <m:sSup>
+          <m:e>
+            <m:r>
+              <m:t>10</m:t>
+            </m:r>
+          </m:e>
+          <m:sup>
+            <m:r>
+              <m:rPr>
+                <m:sty m:val="p"/>
+              </m:rPr>
+              <m:t>−</m:t>
+            </m:r>
+            <m:r>
+              <m:t>85</m:t>
+            </m:r>
+          </m:sup>
+        </m:sSup>
+      </m:oMath>
+      <w:r>
+        <w:t xml:space="preserve"> </w:t>
+      </w:r>
+      <w:r>
+        <w:t xml:space="preserve">(см. приложение Г.4). Поэтому городская метка в программе не должна</w:t>
+      </w:r>
+      <w:r>
+        <w:t xml:space="preserve"> </w:t>
+      </w:r>
+      <w:r>
+        <w:t xml:space="preserve">автоматически читаться как место работы, тип учреждения или отсутствие институции:</w:t>
+      </w:r>
+      <w:r>
+        <w:t xml:space="preserve"> </w:t>
+      </w:r>
+      <w:r>
+        <w:t xml:space="preserve">прежде всего это редакционный стандарт публикации программы.</w:t>
+      </w:r>
+    </w:p>
+    <w:p>
+      <w:pPr>
+        <w:pStyle w:val="BodyText"/>
+      </w:pPr>
+      <w:r>
+        <w:rPr>
+          <w:b/>
+          <w:bCs/>
+        </w:rPr>
+        <w:t xml:space="preserve">Н12. Периферийное участие может быть чаще внеуниверситетским или</w:t>
+      </w:r>
+      <w:r>
+        <w:rPr>
+          <w:b/>
+          <w:bCs/>
+        </w:rPr>
+        <w:t xml:space="preserve"> </w:t>
+      </w:r>
+      <w:r>
+        <w:rPr>
+          <w:b/>
+          <w:bCs/>
+        </w:rPr>
+        <w:t xml:space="preserve">внеинституциональным, но текущий корпус сам по себе этого не доказывает.</w:t>
+      </w:r>
+      <w:r>
+        <w:t xml:space="preserve"> </w:t>
+      </w:r>
+      <w:r>
+        <w:t xml:space="preserve">Данные</w:t>
+      </w:r>
+      <w:r>
+        <w:t xml:space="preserve"> </w:t>
+      </w:r>
+      <w:r>
+        <w:t xml:space="preserve">уверенно показывают более низкую возвращаемость региональных участников: 36.1%</w:t>
+      </w:r>
+      <w:r>
+        <w:t xml:space="preserve"> </w:t>
+      </w:r>
+      <w:r>
+        <w:t xml:space="preserve">против примерно 59% у столичных групп. Однако из строки «Казань», «Калининград»,</w:t>
+      </w:r>
+      <w:r>
+        <w:t xml:space="preserve"> </w:t>
+      </w:r>
+      <w:r>
+        <w:t xml:space="preserve">«Пенза» или «Екатеринбург» нельзя вывести, работает ли участник в университете,</w:t>
+      </w:r>
+      <w:r>
+        <w:t xml:space="preserve"> </w:t>
+      </w:r>
+      <w:r>
+        <w:t xml:space="preserve">академическом институте, музее, школе, независимом исследовательском статусе или</w:t>
+      </w:r>
+      <w:r>
+        <w:t xml:space="preserve"> </w:t>
+      </w:r>
+      <w:r>
+        <w:t xml:space="preserve">иной организации. Следовательно, корректная формулировка Н12 такова: региональная</w:t>
+      </w:r>
+      <w:r>
+        <w:t xml:space="preserve"> </w:t>
+      </w:r>
+      <w:r>
+        <w:t xml:space="preserve">периферия демонстрирует более слабую когортную устойчивость, а гипотеза о ее</w:t>
+      </w:r>
+      <w:r>
+        <w:t xml:space="preserve"> </w:t>
+      </w:r>
+      <w:r>
+        <w:t xml:space="preserve">внеуниверситетском характере требует отдельного authority-слоя с ручной или внешней</w:t>
+      </w:r>
+      <w:r>
+        <w:t xml:space="preserve"> </w:t>
+      </w:r>
+      <w:r>
+        <w:t xml:space="preserve">верификацией занятости. Пенза в этом смысле должна рассматриваться как возможное</w:t>
+      </w:r>
+      <w:r>
+        <w:t xml:space="preserve"> </w:t>
+      </w:r>
+      <w:r>
+        <w:t xml:space="preserve">исключение и контрольный кейс, а не как вывод из одной городской метки.</w:t>
+      </w:r>
+    </w:p>
+    <w:p>
+      <w:pPr>
+        <w:pStyle w:val="BodyText"/>
+      </w:pPr>
+      <w:r>
+        <w:rPr>
+          <w:b/>
+          <w:bCs/>
+        </w:rPr>
+        <w:t xml:space="preserve">Н13. YouTube-покрытие является не нейтральным зеркалом корпуса, а смещенным слоем</w:t>
+      </w:r>
+      <w:r>
+        <w:rPr>
+          <w:b/>
+          <w:bCs/>
+        </w:rPr>
+        <w:t xml:space="preserve"> </w:t>
+      </w:r>
+      <w:r>
+        <w:rPr>
+          <w:b/>
+          <w:bCs/>
+        </w:rPr>
+        <w:t xml:space="preserve">публичной видимости.</w:t>
+      </w:r>
+      <w:r>
+        <w:t xml:space="preserve"> </w:t>
+      </w:r>
+      <w:r>
+        <w:t xml:space="preserve">В собранных плейлистах насчитывается 178 видеозаписей, из</w:t>
+      </w:r>
+      <w:r>
+        <w:t xml:space="preserve"> </w:t>
+      </w:r>
+      <w:r>
+        <w:t xml:space="preserve">которых 89 автоматически сопоставлены с докладами, 65 требуют ручной проверки и</w:t>
+      </w:r>
+      <w:r>
+        <w:t xml:space="preserve"> </w:t>
+      </w:r>
+      <w:r>
+        <w:t xml:space="preserve">24 относятся к пропускам или сессионным записям. На уровне базы прямые ссылки на</w:t>
+      </w:r>
+      <w:r>
+        <w:t xml:space="preserve"> </w:t>
+      </w:r>
+      <w:r>
+        <w:t xml:space="preserve">видео привязаны к 82 уникальным докладам (84 авторским карточкам). Это покрытие</w:t>
+      </w:r>
+      <w:r>
+        <w:t xml:space="preserve"> </w:t>
+      </w:r>
+      <w:r>
+        <w:t xml:space="preserve">сильно неравномерно: оно относится почти исключительно к Зографским чтениям,</w:t>
+      </w:r>
+      <w:r>
+        <w:t xml:space="preserve"> </w:t>
+      </w:r>
+      <w:r>
+        <w:t xml:space="preserve">концентрируется в отдельных годах (особенно 2020 и 2025 гг.) и заметно различается</w:t>
+      </w:r>
+      <w:r>
+        <w:t xml:space="preserve"> </w:t>
+      </w:r>
+      <w:r>
+        <w:t xml:space="preserve">по тематическим группам. Поэтому видеослой полезен для анализа открытости и</w:t>
+      </w:r>
+      <w:r>
+        <w:t xml:space="preserve"> </w:t>
+      </w:r>
+      <w:r>
+        <w:t xml:space="preserve">видимости, но не должен использоваться как репрезентативная выборка всего корпуса</w:t>
+      </w:r>
+      <w:r>
+        <w:t xml:space="preserve"> </w:t>
+      </w:r>
+      <w:r>
+        <w:t xml:space="preserve">без поправки на смещение публикации.</w:t>
+      </w:r>
+    </w:p>
+    <w:p>
+      <w:pPr>
+        <w:pStyle w:val="BodyText"/>
+      </w:pPr>
+      <w:r>
+        <w:rPr>
+          <w:b/>
+          <w:bCs/>
+        </w:rPr>
+        <w:t xml:space="preserve">Н14. Шкала Гумилева фиксирует преобладание микрокейсового уровня обобщения.</w:t>
+      </w:r>
+      <w:r>
+        <w:t xml:space="preserve"> </w:t>
+      </w:r>
+      <w:r>
+        <w:t xml:space="preserve">Для навигации по докладам введена отдельная шкала уровня обобщения: G1 – отдельный</w:t>
+      </w:r>
+      <w:r>
+        <w:t xml:space="preserve"> </w:t>
+      </w:r>
+      <w:r>
+        <w:t xml:space="preserve">текст, автор, источник, термин или локальный сюжет; G2 – региональная традиция,</w:t>
+      </w:r>
+      <w:r>
+        <w:t xml:space="preserve"> </w:t>
+      </w:r>
+      <w:r>
+        <w:t xml:space="preserve">школа, жанр или длительная историко-культурная линия; G3 – широкий</w:t>
+      </w:r>
+      <w:r>
+        <w:t xml:space="preserve"> </w:t>
+      </w:r>
+      <w:r>
+        <w:t xml:space="preserve">сравнительный, цивилизационный или методологический уровень. В интерфейсе</w:t>
+      </w:r>
+      <w:r>
+        <w:t xml:space="preserve"> </w:t>
+      </w:r>
+      <w:r>
+        <w:t xml:space="preserve">микросайта эти уровни показаны как L1–L3, но в статье они обозначаются G1–G3,</w:t>
+      </w:r>
+      <w:r>
+        <w:t xml:space="preserve"> </w:t>
+      </w:r>
+      <w:r>
+        <w:t xml:space="preserve">чтобы не смешивать их с тематическими кодами L1/L2/L4. По 895 уникальным докладам</w:t>
+      </w:r>
+      <w:r>
+        <w:t xml:space="preserve"> </w:t>
+      </w:r>
+      <w:r>
+        <w:t xml:space="preserve">распределение резко асимметрично: G1 – 852 доклада, G2 – 37, G3 – 6. Тем самым</w:t>
+      </w:r>
+      <w:r>
+        <w:t xml:space="preserve"> </w:t>
+      </w:r>
+      <w:r>
+        <w:t xml:space="preserve">корпус в целом устроен как поле конкретных источниковедческих и текстологических</w:t>
+      </w:r>
+      <w:r>
+        <w:t xml:space="preserve"> </w:t>
+      </w:r>
+      <w:r>
+        <w:t xml:space="preserve">кейсов, а не как пространство регулярных макросравнительных обобщений.</w:t>
+      </w:r>
+    </w:p>
+    <w:p>
+      <w:pPr>
+        <w:pStyle w:val="BodyText"/>
+      </w:pPr>
+      <w:r>
+        <w:rPr>
+          <w:b/>
+          <w:bCs/>
+        </w:rPr>
+        <w:t xml:space="preserve">Н15. Классификация по заголовку в большинстве случаев устойчива, но видеоконтекст</w:t>
+      </w:r>
+      <w:r>
+        <w:rPr>
+          <w:b/>
+          <w:bCs/>
+        </w:rPr>
+        <w:t xml:space="preserve"> </w:t>
+      </w:r>
+      <w:r>
+        <w:rPr>
+          <w:b/>
+          <w:bCs/>
+        </w:rPr>
+        <w:t xml:space="preserve">обнаруживает границы автоматической разметки.</w:t>
+      </w:r>
+      <w:r>
+        <w:t xml:space="preserve"> </w:t>
+      </w:r>
+      <w:r>
+        <w:t xml:space="preserve">Для 89 сопоставленных видеозаписей</w:t>
+      </w:r>
+      <w:r>
+        <w:t xml:space="preserve"> </w:t>
+      </w:r>
+      <w:r>
+        <w:t xml:space="preserve">сравнение уровня Гумилева, назначенного только по названию доклада, с уровнем,</w:t>
+      </w:r>
+      <w:r>
+        <w:t xml:space="preserve"> </w:t>
+      </w:r>
+      <w:r>
+        <w:t xml:space="preserve">полученным с учетом названия видео, дает 76 совпадений и 13 расхождений, то есть</w:t>
+      </w:r>
+      <w:r>
+        <w:t xml:space="preserve"> </w:t>
+      </w:r>
+      <w:r>
+        <w:t xml:space="preserve">согласие около 85%. Это достаточный уровень для навигационной классификации и</w:t>
+      </w:r>
+      <w:r>
+        <w:t xml:space="preserve"> </w:t>
+      </w:r>
+      <w:r>
+        <w:t xml:space="preserve">первичной статистики, но не для жестких выводов о научном стиле отдельного автора</w:t>
+      </w:r>
+      <w:r>
+        <w:t xml:space="preserve"> </w:t>
+      </w:r>
+      <w:r>
+        <w:t xml:space="preserve">без просмотра записи и ручной верификации спорных случаев.</w:t>
+      </w:r>
+    </w:p>
+    <w:p>
+      <w:pPr>
+        <w:pStyle w:val="BodyText"/>
+      </w:pPr>
+      <w:r>
+        <w:t xml:space="preserve">Таким образом, Н11–Н15 расширяют основную аргументацию статьи в сторону критики</w:t>
+      </w:r>
+      <w:r>
+        <w:t xml:space="preserve"> </w:t>
+      </w:r>
+      <w:r>
+        <w:t xml:space="preserve">источника. Они показывают, что корпус содержит не только данные о людях и темах,</w:t>
+      </w:r>
+      <w:r>
+        <w:t xml:space="preserve"> </w:t>
+      </w:r>
+      <w:r>
+        <w:t xml:space="preserve">но и следы разных режимов публичной репрезентации: программы по-разному показывают</w:t>
+      </w:r>
+      <w:r>
+        <w:t xml:space="preserve"> </w:t>
+      </w:r>
+      <w:r>
+        <w:t xml:space="preserve">аффилиации, видеозаписи неравномерно распределяют видимость, а масштаб обобщения</w:t>
+      </w:r>
+      <w:r>
+        <w:t xml:space="preserve"> </w:t>
+      </w:r>
+      <w:r>
+        <w:t xml:space="preserve">доклада зависит от того, читаем ли мы только заголовок или сопоставляем его с</w:t>
+      </w:r>
+      <w:r>
+        <w:t xml:space="preserve"> </w:t>
+      </w:r>
+      <w:r>
+        <w:t xml:space="preserve">медиаконтекстом.</w:t>
+      </w:r>
+    </w:p>
+    <w:bookmarkEnd w:id="59"/>
+    <w:bookmarkStart w:id="60" w:name="заключение"/>
+    <w:p>
+      <w:pPr>
+        <w:pStyle w:val="Heading2"/>
+      </w:pPr>
+      <w:r>
+        <w:t xml:space="preserve">11. Заключение</w:t>
+      </w:r>
+    </w:p>
+    <w:p>
+      <w:pPr>
+        <w:pStyle w:val="FirstParagraph"/>
+      </w:pPr>
+      <w:r>
+        <w:t xml:space="preserve">Главные выводы настоящего исследования можно резюмировать в шестнадцати пунктах.</w:t>
       </w:r>
     </w:p>
     <w:p>
@@ -11007,46 +11557,168 @@
     </w:p>
     <w:p>
       <w:pPr>
+        <w:pStyle w:val="Compact"/>
+        <w:numPr>
+          <w:ilvl w:val="0"/>
+          <w:numId w:val="1007"/>
+        </w:numPr>
+      </w:pPr>
+      <w:r>
+        <w:rPr>
+          <w:b/>
+          <w:bCs/>
+        </w:rPr>
+        <w:t xml:space="preserve">«Город вместо учреждения» является прежде всего источниковедческим эффектом.</w:t>
+      </w:r>
+      <w:r>
+        <w:t xml:space="preserve"> </w:t>
+      </w:r>
+      <w:r>
+        <w:t xml:space="preserve">Различие между Зографскими и Рериховскими чтениями по доле записей только с городом слишком велико и устойчиво, чтобы читать его как прямое свидетельство биографической внеинституциональности участников. Оно отражает разные стандарты публикации программ.</w:t>
+      </w:r>
+    </w:p>
+    <w:p>
+      <w:pPr>
+        <w:pStyle w:val="Compact"/>
+        <w:numPr>
+          <w:ilvl w:val="0"/>
+          <w:numId w:val="1007"/>
+        </w:numPr>
+      </w:pPr>
+      <w:r>
+        <w:rPr>
+          <w:b/>
+          <w:bCs/>
+        </w:rPr>
+        <w:t xml:space="preserve">Гипотеза о внеуниверситетском характере периферии требует отдельной проверки.</w:t>
+      </w:r>
+      <w:r>
+        <w:t xml:space="preserve"> </w:t>
+      </w:r>
+      <w:r>
+        <w:t xml:space="preserve">Корпус подтверждает более низкую возвращаемость региональных участников, но не позволяет автоматически установить тип их занятости. Поэтому тезис о периферийных неуниверситетских траекториях должен проверяться через authority-слой; Пенза выступает здесь не доказательством, а важным контрольным случаем.</w:t>
+      </w:r>
+    </w:p>
+    <w:p>
+      <w:pPr>
+        <w:pStyle w:val="Compact"/>
+        <w:numPr>
+          <w:ilvl w:val="0"/>
+          <w:numId w:val="1007"/>
+        </w:numPr>
+      </w:pPr>
+      <w:r>
+        <w:rPr>
+          <w:b/>
+          <w:bCs/>
+        </w:rPr>
+        <w:t xml:space="preserve">YouTube-слой расширяет публичную проверяемость, но вносит смещение видимости.</w:t>
+      </w:r>
+      <w:r>
+        <w:t xml:space="preserve"> </w:t>
+      </w:r>
+      <w:r>
+        <w:t xml:space="preserve">178 собранных видеозаписей и 82 напрямую привязанных к базе доклада полезны для проверки отдельных случаев, однако их распределение по годам, площадкам и темам не репрезентативно для всего корпуса.</w:t>
+      </w:r>
+    </w:p>
+    <w:p>
+      <w:pPr>
+        <w:pStyle w:val="Compact"/>
+        <w:numPr>
+          <w:ilvl w:val="0"/>
+          <w:numId w:val="1007"/>
+        </w:numPr>
+      </w:pPr>
+      <w:r>
+        <w:rPr>
+          <w:b/>
+          <w:bCs/>
+        </w:rPr>
+        <w:t xml:space="preserve">Шкала Гумилева показывает преобладание микрокейсового уровня.</w:t>
+      </w:r>
+      <w:r>
+        <w:t xml:space="preserve"> </w:t>
+      </w:r>
+      <w:r>
+        <w:t xml:space="preserve">Из 895 уникальных докладов 852 отнесены к уровню конкретного текста, автора, источника или локального сюжета; только 37 выходят на региональный уровень и 6 – на широкий сравнительный или методологический уровень. Это подтверждает текстоцентричный и кейсоцентричный характер поля.</w:t>
+      </w:r>
+    </w:p>
+    <w:p>
+      <w:pPr>
+        <w:pStyle w:val="Compact"/>
+        <w:numPr>
+          <w:ilvl w:val="0"/>
+          <w:numId w:val="1007"/>
+        </w:numPr>
+      </w:pPr>
+      <w:r>
+        <w:rPr>
+          <w:b/>
+          <w:bCs/>
+        </w:rPr>
+        <w:t xml:space="preserve">Сопоставление заголовков с видеоконтекстом задает границу автоматической классификации.</w:t>
+      </w:r>
+      <w:r>
+        <w:t xml:space="preserve"> </w:t>
+      </w:r>
+      <w:r>
+        <w:t xml:space="preserve">В 76 из 89 сопоставленных видеослучаев уровень обобщения совпадает, но 13 расхождений показывают, что навигационная разметка не должна подменять ручную экспертную интерпретацию спорных докладов.</w:t>
+      </w:r>
+    </w:p>
+    <w:p>
+      <w:pPr>
         <w:pStyle w:val="FirstParagraph"/>
       </w:pPr>
       <w:r>
-        <w:t xml:space="preserve">Демографически на обеих площадках видимое ядро стареет, хотя возрастной ряд не</w:t>
-      </w:r>
-      <w:r>
-        <w:t xml:space="preserve"> </w:t>
-      </w:r>
-      <w:r>
-        <w:t xml:space="preserve">монотонен и сильно зависит от неполноты биографических сведений. Для участников с</w:t>
-      </w:r>
-      <w:r>
-        <w:t xml:space="preserve"> </w:t>
-      </w:r>
-      <w:r>
-        <w:t xml:space="preserve">подтвержденным годом рождения медиана в 2012–2025 гг. выросла с 42 до 55 лет в</w:t>
-      </w:r>
-      <w:r>
-        <w:t xml:space="preserve"> </w:t>
-      </w:r>
-      <w:r>
-        <w:t xml:space="preserve">Зографских чтениях и с 46 до 53 лет в Рериховских. В обозримой перспективе обе</w:t>
-      </w:r>
-      <w:r>
-        <w:t xml:space="preserve"> </w:t>
-      </w:r>
-      <w:r>
-        <w:t xml:space="preserve">площадки столкнутся с задачей воспроизводства состава, и обе сегодняшние модели</w:t>
-      </w:r>
-      <w:r>
-        <w:t xml:space="preserve"> </w:t>
-      </w:r>
-      <w:r>
-        <w:t xml:space="preserve">институционализации (плотное ядро ИВ РАН в Москве и более диффузная межинституциональная</w:t>
-      </w:r>
-      <w:r>
-        <w:t xml:space="preserve"> </w:t>
-      </w:r>
-      <w:r>
-        <w:t xml:space="preserve">сеть в Петербурге) будут испытаны на прочность задачей привлечения новых поколений.</w:t>
+        <w:t xml:space="preserve">Демографически обе площадки демонстрируют не простое монотонное старение, а более</w:t>
+      </w:r>
+      <w:r>
+        <w:t xml:space="preserve"> </w:t>
+      </w:r>
+      <w:r>
+        <w:t xml:space="preserve">сложную задачу воспроизводства состава. Сплошная биографическая верификация показывает,</w:t>
+      </w:r>
+      <w:r>
+        <w:t xml:space="preserve"> </w:t>
+      </w:r>
+      <w:r>
+        <w:t xml:space="preserve">что возраст первого наблюдаемого выступления снижается по сравнению с ранним периодом,</w:t>
+      </w:r>
+      <w:r>
+        <w:t xml:space="preserve"> </w:t>
+      </w:r>
+      <w:r>
+        <w:t xml:space="preserve">а в 2025 г. обе площадки сходятся на медианном возрасте участников 47.5 лет. Поэтому</w:t>
+      </w:r>
+      <w:r>
+        <w:t xml:space="preserve"> </w:t>
+      </w:r>
+      <w:r>
+        <w:t xml:space="preserve">главное напряжение состоит не в механическом отсутствии молодых кадров, а в том, что</w:t>
+      </w:r>
+      <w:r>
+        <w:t xml:space="preserve"> </w:t>
+      </w:r>
+      <w:r>
+        <w:t xml:space="preserve">новые участники и региональная периферия слабее закрепляются в устойчивой когорте.</w:t>
+      </w:r>
+      <w:r>
+        <w:t xml:space="preserve"> </w:t>
+      </w:r>
+      <w:r>
+        <w:t xml:space="preserve">В обозримой перспективе обе сегодняшние модели институционализации (плотное ядро</w:t>
+      </w:r>
+      <w:r>
+        <w:t xml:space="preserve"> </w:t>
+      </w:r>
+      <w:r>
+        <w:t xml:space="preserve">ИВ РАН в Москве и более диффузная межинституциональная сеть в Петербурге) будут</w:t>
+      </w:r>
+      <w:r>
+        <w:t xml:space="preserve"> </w:t>
+      </w:r>
+      <w:r>
+        <w:t xml:space="preserve">испытаны на прочность задачей привлечения и удержания новых поколений.</w:t>
       </w:r>
     </w:p>
     <w:p>
@@ -11100,13 +11772,13 @@
           <w:b/>
           <w:bCs/>
         </w:rPr>
-        <w:t xml:space="preserve">Монотематическая сериализация как укрытие в нишах (Н10).</w:t>
-      </w:r>
-      <w:r>
-        <w:t xml:space="preserve"> </w:t>
-      </w:r>
-      <w:r>
-        <w:t xml:space="preserve">Обнаруженная склонность к многолетнему последовательному чтению докладов по одной узкой теме (сериализации) отражает стратегию консервации символических микродоменов. Вместо горизонтального обмена и динамической смены тем участники предпочитают годами воспроизводить замкнутые персональные нарративы, что минимизирует точки соприкосновения (и, как следствие, потенциальные зоны критики) между коллегами.</w:t>
+        <w:t xml:space="preserve">Монотематическая сериализация как индивидуальный стиль, а не массовая стратегия (Н10).</w:t>
+      </w:r>
+      <w:r>
+        <w:t xml:space="preserve"> </w:t>
+      </w:r>
+      <w:r>
+        <w:t xml:space="preserve">Проверка не выявила статистически значимого различия между ядром и периферией и показала низкую общую долю сериализованных докладов. Поэтому этот признак не следует трактовать как доминирующий механизм закрытости сообщества; скорее он указывает на отдельные долговременные исследовательские траектории, где авторы годами разворачивают один узкий сюжет.</w:t>
       </w:r>
     </w:p>
     <w:p>
@@ -11166,13 +11838,13 @@
           <w:b/>
           <w:bCs/>
         </w:rPr>
-        <w:t xml:space="preserve">Ресурсно-демографическое сжатие как катализатор антагонизма.</w:t>
-      </w:r>
-      <w:r>
-        <w:t xml:space="preserve"> </w:t>
-      </w:r>
-      <w:r>
-        <w:t xml:space="preserve">На фоне неуклонного старения ядра (рост медианного возраста до 53–55 лет) и дефицита молодых кадров борьба за выживание институтов обостряется. В условиях сжимающегося поля символические ресурсы (статус «профильного индолога», право вето на конференциях, монополия на экспертное знание) становятся объектом жесткой конкуренции. В результате академические «островки» превращаются в оборонительные крепости, где закрытость от внешнего мира и подозрительность к соседним школам рассматриваются как гарантия сохранения групповой идентичности.</w:t>
+        <w:t xml:space="preserve">Ресурсно-демографическое напряжение как задача воспроизводства.</w:t>
+      </w:r>
+      <w:r>
+        <w:t xml:space="preserve"> </w:t>
+      </w:r>
+      <w:r>
+        <w:t xml:space="preserve">Сплошная биографическая верификация не подтверждает прежний образ резкого старения корпуса: в 2025 г. обе площадки сходятся на медианном возрасте 47.5 лет, а возраст дебюта снижается по сравнению с ранним периодом. Напряжение состоит не в простом отсутствии молодых кадров, а в том, что новые участники и региональная периферия слабее удерживаются в устойчивой когорте; поэтому борьба за символические ресурсы (статус «профильного индолога», право отбора, экспертная монополия) остается связанной с задачей воспроизводства ядра.</w:t>
       </w:r>
     </w:p>
     <w:p>
@@ -11190,8 +11862,8 @@
         </w:pict>
       </w:r>
     </w:p>
-    <w:bookmarkEnd w:id="59"/>
-    <w:bookmarkStart w:id="60" w:name="сноски"/>
+    <w:bookmarkEnd w:id="60"/>
+    <w:bookmarkStart w:id="61" w:name="сноски"/>
     <w:p>
       <w:pPr>
         <w:pStyle w:val="Heading2"/>
@@ -11234,8 +11906,8 @@
         <w:t xml:space="preserve">Мы провели сплошную архивную и просопографическую верификацию биографических данных для всей когорты из 220 ученых. Использование оценочных прокси-метрик по внешним базам вроде OpenAlex не потребовалось, что позволило полностью исключить селективное смещение выборки.</w:t>
       </w:r>
     </w:p>
-    <w:bookmarkEnd w:id="60"/>
-    <w:bookmarkStart w:id="61" w:name="литература"/>
+    <w:bookmarkEnd w:id="61"/>
+    <w:bookmarkStart w:id="62" w:name="литература"/>
     <w:p>
       <w:pPr>
         <w:pStyle w:val="Heading2"/>
@@ -11471,8 +12143,8 @@
         </w:pict>
       </w:r>
     </w:p>
-    <w:bookmarkEnd w:id="61"/>
-    <w:bookmarkStart w:id="62" w:name="X9869427767835cb95d2b14937be998a537aee4b"/>
+    <w:bookmarkEnd w:id="62"/>
+    <w:bookmarkStart w:id="63" w:name="X9869427767835cb95d2b14937be998a537aee4b"/>
     <w:p>
       <w:pPr>
         <w:pStyle w:val="Heading2"/>
@@ -11793,8 +12465,8 @@
         <w:t xml:space="preserve">перекрестной когорты как публично видимого межплощадочного слоя российской индологии.</w:t>
       </w:r>
     </w:p>
-    <w:bookmarkEnd w:id="62"/>
-    <w:bookmarkStart w:id="63" w:name="X1dd321cbee9b012b9841ef190851adae90796c2"/>
+    <w:bookmarkEnd w:id="63"/>
+    <w:bookmarkStart w:id="64" w:name="X1dd321cbee9b012b9841ef190851adae90796c2"/>
     <w:p>
       <w:pPr>
         <w:pStyle w:val="Heading2"/>
@@ -13139,8 +13811,8 @@
         <w:t xml:space="preserve">Анализ таблицы выявляет несколько важных тенденций. Во-первых, доля дебютантов заметно снизилась с 2004 по 2022 год: если на первых конференциях новичками были 80–100% участников, то к 2021–2022 году этот показатель упал до 10–11% для Зографа и 0% для Рериха. Во-вторых, медианный возраст участников с известным годом рождения растет неровно: пики приходятся на 2020–2023 гг., а в 2024–2025 гг. новые участники частично снижают медиану. В-третьих, заметен скачок дебютантов в 2025 году для Рериха (38.9%) и в предварительной программе 2026 года для Зографа (31.7%), что может отражать изменение состава или расширение охвата. Наконец, 2020 год на фоне пандемии показал повышенный приток новых докладчиков на Зографских чтениях (39.1%), но последующая проверка возвращаемости дебютантов не подтверждает гипотезу об особой устойчивости этой онлайн-когорты.</w:t>
       </w:r>
     </w:p>
-    <w:bookmarkEnd w:id="63"/>
-    <w:bookmarkStart w:id="68" w:name="X340b389af2c8d46814a9bb5656ecba74d6345e6"/>
+    <w:bookmarkEnd w:id="64"/>
+    <w:bookmarkStart w:id="69" w:name="X340b389af2c8d46814a9bb5656ecba74d6345e6"/>
     <w:p>
       <w:pPr>
         <w:pStyle w:val="Heading2"/>
@@ -13157,7 +13829,7 @@
         <w:t xml:space="preserve">В таблицах, представленных ниже, суммированы результаты четырёхуровневой классификации всех 895 докладов, включенных в корпус (837 состоявшихся по 2025 г. и 58 заявленных в предварительной программе Зографских чтений 2026 г.). Каждый доклад кодируется по четырём измерениям: L1 (дисциплина, 10 категорий), L2 (период, 7 категорий), L3 (текстуальный или культурный материал, открытый перечень), L4 (характер исследования, 3 категории). Полный список из 895 кодированных записей передан в редакцию в виде отдельного CSV-файла. В данном приложении приводятся суммарные таблицы распределения по дисциплинам, периодам и характеру исследования, а также репрезентативная выборка из 30 докладов, отобранная из записей с уровнем уверенности ≥ 0,8.</w:t>
       </w:r>
     </w:p>
-    <w:bookmarkStart w:id="64" w:name="в.1.-распределение-по-дисциплинам-l1"/>
+    <w:bookmarkStart w:id="65" w:name="в.1.-распределение-по-дисциплинам-l1"/>
     <w:p>
       <w:pPr>
         <w:pStyle w:val="Heading3"/>
@@ -13943,8 +14615,8 @@
         </w:tc>
       </w:tr>
     </w:tbl>
-    <w:bookmarkEnd w:id="64"/>
-    <w:bookmarkStart w:id="65" w:name="в.2.-распределение-по-периодам-l2"/>
+    <w:bookmarkEnd w:id="65"/>
+    <w:bookmarkStart w:id="66" w:name="в.2.-распределение-по-периодам-l2"/>
     <w:p>
       <w:pPr>
         <w:pStyle w:val="Heading3"/>
@@ -14547,8 +15219,8 @@
         </w:tc>
       </w:tr>
     </w:tbl>
-    <w:bookmarkEnd w:id="65"/>
-    <w:bookmarkStart w:id="66" w:name="X1da2e1f68f201645ca8822c86bd39359260e469"/>
+    <w:bookmarkEnd w:id="66"/>
+    <w:bookmarkStart w:id="67" w:name="X1da2e1f68f201645ca8822c86bd39359260e469"/>
     <w:p>
       <w:pPr>
         <w:pStyle w:val="Heading3"/>
@@ -14907,8 +15579,8 @@
         </w:tc>
       </w:tr>
     </w:tbl>
-    <w:bookmarkEnd w:id="66"/>
-    <w:bookmarkStart w:id="67" w:name="X7bde812e283544149c493a34d333c09dffd92bb"/>
+    <w:bookmarkEnd w:id="67"/>
+    <w:bookmarkStart w:id="68" w:name="X7bde812e283544149c493a34d333c09dffd92bb"/>
     <w:p>
       <w:pPr>
         <w:pStyle w:val="Heading3"/>
@@ -17806,9 +18478,9 @@
         <w:t xml:space="preserve">Как видно из выборки, фундаментальный характер исследований преобладает во всех дисциплинах (29 из 30 примеров). Классический период также доминирует, хотя представлены все основные периоды: ведийский, классический, средневековый, колониальный и новое время. Текстуальный анализ остаётся основным методологическим подходом (93% примеров), с редкими случаями использования архивных источников, артефактов и полевого материала. Полный список из 895 кодированных докладов передан в редакцию как supplementary_theme_codes.csv.</w:t>
       </w:r>
     </w:p>
-    <w:bookmarkEnd w:id="67"/>
     <w:bookmarkEnd w:id="68"/>
-    <w:bookmarkStart w:id="80" w:name="приложение-г.-статистическая-проверка"/>
+    <w:bookmarkEnd w:id="69"/>
+    <w:bookmarkStart w:id="81" w:name="приложение-г.-статистическая-проверка"/>
     <w:p>
       <w:pPr>
         <w:pStyle w:val="Heading2"/>
@@ -17882,7 +18554,7 @@
         <w:t xml:space="preserve">при отсутствии реального эффекта; значения p &lt; 0,05 принято считать значимыми.</w:t>
       </w:r>
     </w:p>
-    <w:bookmarkStart w:id="72" w:name="X9c73641c6671d978a2af600253df0230cf8c6e8"/>
+    <w:bookmarkStart w:id="73" w:name="X9c73641c6671d978a2af600253df0230cf8c6e8"/>
     <w:p>
       <w:pPr>
         <w:pStyle w:val="Heading3"/>
@@ -18028,20 +18700,20 @@
       <w:r>
         <w:drawing>
           <wp:inline>
-            <wp:extent cx="5334000" cy="3164840"/>
+            <wp:extent cx="5334000" cy="3163062"/>
             <wp:effectExtent b="0" l="0" r="0" t="0"/>
-            <wp:docPr descr="Рис. Г1. Нулевое распределение числа учёных на обеих площадках" title="" id="70" name="Picture"/>
+            <wp:docPr descr="Рис. Г1. Нулевое распределение числа учёных на обеих площадках" title="" id="71" name="Picture"/>
             <a:graphic>
               <a:graphicData uri="http://schemas.openxmlformats.org/drawingml/2006/picture">
                 <pic:pic>
                   <pic:nvPicPr>
-                    <pic:cNvPr descr="hypothesis_output/null_model_overlap.png" id="71" name="Picture"/>
+                    <pic:cNvPr descr="hypothesis_output/null_model_overlap.png" id="72" name="Picture"/>
                     <pic:cNvPicPr>
                       <a:picLocks noChangeArrowheads="1" noChangeAspect="1"/>
                     </pic:cNvPicPr>
                   </pic:nvPicPr>
                   <pic:blipFill>
-                    <a:blip r:embed="rId69"/>
+                    <a:blip r:embed="rId70"/>
                     <a:stretch>
                       <a:fillRect/>
                     </a:stretch>
@@ -18049,7 +18721,7 @@
                   <pic:spPr bwMode="auto">
                     <a:xfrm>
                       <a:off x="0" y="0"/>
-                      <a:ext cx="5334000" cy="3164840"/>
+                      <a:ext cx="5334000" cy="3163062"/>
                     </a:xfrm>
                     <a:prstGeom prst="rect">
                       <a:avLst/>
@@ -18121,8 +18793,8 @@
         <w:t xml:space="preserve">одной на другую происходит заметно реже случайного ожидания.</w:t>
       </w:r>
     </w:p>
-    <w:bookmarkEnd w:id="72"/>
-    <w:bookmarkStart w:id="73" w:name="X999cca4bd3cea19d12708d6486e247fa5afecf8"/>
+    <w:bookmarkEnd w:id="73"/>
+    <w:bookmarkStart w:id="74" w:name="X999cca4bd3cea19d12708d6486e247fa5afecf8"/>
     <w:p>
       <w:pPr>
         <w:pStyle w:val="Heading3"/>
@@ -18717,8 +19389,8 @@
         <w:t xml:space="preserve">достигается в группах разного размера.</w:t>
       </w:r>
     </w:p>
-    <w:bookmarkEnd w:id="73"/>
-    <w:bookmarkStart w:id="77" w:name="г.3.-длительность-участия-анализ-дожития"/>
+    <w:bookmarkEnd w:id="74"/>
+    <w:bookmarkStart w:id="78" w:name="г.3.-длительность-участия-анализ-дожития"/>
     <w:p>
       <w:pPr>
         <w:pStyle w:val="Heading3"/>
@@ -18945,18 +19617,18 @@
           <wp:inline>
             <wp:extent cx="5334000" cy="3333750"/>
             <wp:effectExtent b="0" l="0" r="0" t="0"/>
-            <wp:docPr descr="Рис. Г2. Кривые дожития: доля учёных, ещё активных через N лет после дебюта" title="" id="75" name="Picture"/>
+            <wp:docPr descr="Рис. Г2. Кривые дожития: доля учёных, ещё активных через N лет после дебюта" title="" id="76" name="Picture"/>
             <a:graphic>
               <a:graphicData uri="http://schemas.openxmlformats.org/drawingml/2006/picture">
                 <pic:pic>
                   <pic:nvPicPr>
-                    <pic:cNvPr descr="hypothesis_output/km_retention.png" id="76" name="Picture"/>
+                    <pic:cNvPr descr="hypothesis_output/km_retention.png" id="77" name="Picture"/>
                     <pic:cNvPicPr>
                       <a:picLocks noChangeArrowheads="1" noChangeAspect="1"/>
                     </pic:cNvPicPr>
                   </pic:nvPicPr>
                   <pic:blipFill>
-                    <a:blip r:embed="rId74"/>
+                    <a:blip r:embed="rId75"/>
                     <a:stretch>
                       <a:fillRect/>
                     </a:stretch>
@@ -19086,8 +19758,8 @@
         <w:t xml:space="preserve">изложен соответственно осторожно.</w:t>
       </w:r>
     </w:p>
-    <w:bookmarkEnd w:id="77"/>
-    <w:bookmarkStart w:id="78" w:name="Xa6a56e999a3454fdd3573dd4a63a1464363f1e9"/>
+    <w:bookmarkEnd w:id="78"/>
+    <w:bookmarkStart w:id="79" w:name="Xa6a56e999a3454fdd3573dd4a63a1464363f1e9"/>
     <w:p>
       <w:pPr>
         <w:pStyle w:val="Heading3"/>
@@ -19331,8 +20003,8 @@
         <w:t xml:space="preserve">аффилиации) поэтому требует внешних, биографических источников, а не самой программы.</w:t>
       </w:r>
     </w:p>
-    <w:bookmarkEnd w:id="78"/>
-    <w:bookmarkStart w:id="79" w:name="замечание-о-воспроизводимости"/>
+    <w:bookmarkEnd w:id="79"/>
+    <w:bookmarkStart w:id="80" w:name="замечание-о-воспроизводимости"/>
     <w:p>
       <w:pPr>
         <w:pStyle w:val="Heading3"/>
@@ -19445,9 +20117,9 @@
         <w:t xml:space="preserve">).</w:t>
       </w:r>
     </w:p>
-    <w:bookmarkEnd w:id="79"/>
     <w:bookmarkEnd w:id="80"/>
     <w:bookmarkEnd w:id="81"/>
+    <w:bookmarkEnd w:id="82"/>
     <w:sectPr>
       <w:footnotePr>
         <w:numRestart w:val="eachSect"/>

</xml_diff>

<commit_message>
release: prepare PPV submission — sync anonymous copy, update cover letter, rebuild DB and site data
</commit_message>
<xml_diff>
--- a/article/ppv_draft.docx
+++ b/article/ppv_draft.docx
@@ -1441,6 +1441,74 @@
       </w:r>
       <w:r>
         <w:t xml:space="preserve">границу доли онлайн-участия.</w:t>
+      </w:r>
+    </w:p>
+    <w:p>
+      <w:pPr>
+        <w:pStyle w:val="BodyText"/>
+      </w:pPr>
+      <w:r>
+        <w:t xml:space="preserve">Отдельно следует различать опубликованную программу и фактически состоявшийся ход</w:t>
+      </w:r>
+      <w:r>
+        <w:t xml:space="preserve"> </w:t>
+      </w:r>
+      <w:r>
+        <w:t xml:space="preserve">заседания. Программа фиксирует заявленное административное состояние расписания на</w:t>
+      </w:r>
+      <w:r>
+        <w:t xml:space="preserve"> </w:t>
+      </w:r>
+      <w:r>
+        <w:t xml:space="preserve">момент публикации, но не гарантирует, что каждый доклад был прочитан именно в</w:t>
+      </w:r>
+      <w:r>
+        <w:t xml:space="preserve"> </w:t>
+      </w:r>
+      <w:r>
+        <w:t xml:space="preserve">указанном формате и порядке. На практике возможны переход очного доклада в</w:t>
+      </w:r>
+      <w:r>
+        <w:t xml:space="preserve"> </w:t>
+      </w:r>
+      <w:r>
+        <w:t xml:space="preserve">онлайн-режим, перестановка выступлений внутри секции, отмена доклада или неявка</w:t>
+      </w:r>
+      <w:r>
+        <w:t xml:space="preserve"> </w:t>
+      </w:r>
+      <w:r>
+        <w:t xml:space="preserve">докладчика; при этом публичная программа после события может не обновляться. Поэтому</w:t>
+      </w:r>
+      <w:r>
+        <w:t xml:space="preserve"> </w:t>
+      </w:r>
+      <w:r>
+        <w:t xml:space="preserve">записи корпуса в настоящей статье трактуются как данные о публичной программной</w:t>
+      </w:r>
+      <w:r>
+        <w:t xml:space="preserve"> </w:t>
+      </w:r>
+      <w:r>
+        <w:t xml:space="preserve">видимости, а не как самостоятельное доказательство фактического присутствия,</w:t>
+      </w:r>
+      <w:r>
+        <w:t xml:space="preserve"> </w:t>
+      </w:r>
+      <w:r>
+        <w:t xml:space="preserve">прослушивания или рецепции доклада. Такие утверждения требуют дополнительной</w:t>
+      </w:r>
+      <w:r>
+        <w:t xml:space="preserve"> </w:t>
+      </w:r>
+      <w:r>
+        <w:t xml:space="preserve">верификации по видеозаписям, расписаниям дня, свидетельствам участников или</w:t>
+      </w:r>
+      <w:r>
+        <w:t xml:space="preserve"> </w:t>
+      </w:r>
+      <w:r>
+        <w:t xml:space="preserve">протоколам заседаний.</w:t>
       </w:r>
     </w:p>
     <w:p>

</xml_diff>